<commit_message>
fix(core): Master correction SSOT Lock Rule, tach biet Lock va Delete Policy, gia co Task Chain
</commit_message>
<xml_diff>
--- a/docs/MASTER SSOT - HỆ THỐNG PHONG ẤN DỤC VỌNG.docx
+++ b/docs/MASTER SSOT - HỆ THỐNG PHONG ẤN DỤC VỌNG.docx
@@ -1,6 +1,6 @@
 
 <file path=word/document.xml><?xml version="1.0" encoding="utf-8"?>
-<w:document xmlns:mc="http://schemas.openxmlformats.org/markup-compatibility/2006" xmlns:o="urn:schemas-microsoft-com:office:office" xmlns:r="http://schemas.openxmlformats.org/officeDocument/2006/relationships" xmlns:m="http://schemas.openxmlformats.org/officeDocument/2006/math" xmlns:v="urn:schemas-microsoft-com:vml" xmlns:wp="http://schemas.openxmlformats.org/drawingml/2006/wordprocessingDrawing" xmlns:w10="urn:schemas-microsoft-com:office:word" xmlns:w="http://schemas.openxmlformats.org/wordprocessingml/2006/main" xmlns:wne="http://schemas.microsoft.com/office/word/2006/wordml" xmlns:sl="http://schemas.openxmlformats.org/schemaLibrary/2006/main" xmlns:a="http://schemas.openxmlformats.org/drawingml/2006/main" xmlns:pic="http://schemas.openxmlformats.org/drawingml/2006/picture" xmlns:c="http://schemas.openxmlformats.org/drawingml/2006/chart" xmlns:lc="http://schemas.openxmlformats.org/drawingml/2006/lockedCanvas" xmlns:dgm="http://schemas.openxmlformats.org/drawingml/2006/diagram" xmlns:wps="http://schemas.microsoft.com/office/word/2010/wordprocessingShape" xmlns:wpg="http://schemas.microsoft.com/office/word/2010/wordprocessingGroup" xmlns:w14="http://schemas.microsoft.com/office/word/2010/wordml" xmlns:w15="http://schemas.microsoft.com/office/word/2012/wordml" xmlns:w16="http://schemas.microsoft.com/office/word/2018/wordml" xmlns:w16cex="http://schemas.microsoft.com/office/word/2018/wordml/cex" xmlns:w16cid="http://schemas.microsoft.com/office/word/2016/wordml/cid" xmlns="http://schemas.microsoft.com/office/tasks/2019/documenttasks" xmlns:cr="http://schemas.microsoft.com/office/comments/2020/reactions">
+<w:document xmlns:ns3="urn:schemas-microsoft-com:office:office" xmlns:v="urn:schemas-microsoft-com:vml" xmlns:w="http://schemas.openxmlformats.org/wordprocessingml/2006/main" xmlns:w14="http://schemas.microsoft.com/office/word/2010/wordml">
   <w:background w:color="FFFFFF"/>
   <w:body>
     <w:p>
@@ -46,7 +46,7 @@
       </w:pPr>
       <w:r>
         <w:pict>
-          <v:rect style="width:0.0pt;height:1.5pt" o:hr="t" o:hrstd="t" o:hralign="center" fillcolor="#A0A0A0" stroked="f"/>
+          <v:rect style="width:0.0pt;height:1.5pt" ns3:hr="t" ns3:hrstd="t" ns3:hralign="center" fillcolor="#A0A0A0" stroked="f"/>
         </w:pict>
       </w:r>
       <w:r>
@@ -200,7 +200,7 @@
       </w:pPr>
       <w:r>
         <w:pict>
-          <v:rect style="width:0.0pt;height:1.5pt" o:hr="t" o:hrstd="t" o:hralign="center" fillcolor="#A0A0A0" stroked="f"/>
+          <v:rect style="width:0.0pt;height:1.5pt" ns3:hr="t" ns3:hrstd="t" ns3:hralign="center" fillcolor="#A0A0A0" stroked="f"/>
         </w:pict>
       </w:r>
       <w:r>
@@ -365,7 +365,7 @@
           <w:szCs w:val="22"/>
           <w:rtl w:val="0"/>
         </w:rPr>
-        <w:t xml:space="preserve">PHẦN VII — QUY TẮC MỞ KHÓA 2/3 (2/3 UNLOCK RULE)</w:t>
+        <w:t xml:space="preserve">PHẦN VII — QUY TẮC GIẢI PHÓNG ỨNG DỤNG KHỎI BẢO KHỐ 2/3 (2/3 DELETION ELIGIBILITY RULE)</w:t>
       </w:r>
     </w:p>
     <w:p>
@@ -982,7 +982,7 @@
       </w:pPr>
       <w:r>
         <w:pict>
-          <v:rect style="width:0.0pt;height:1.5pt" o:hr="t" o:hrstd="t" o:hralign="center" fillcolor="#A0A0A0" stroked="f"/>
+          <v:rect style="width:0.0pt;height:1.5pt" ns3:hr="t" ns3:hrstd="t" ns3:hralign="center" fillcolor="#A0A0A0" stroked="f"/>
         </w:pict>
       </w:r>
       <w:r>
@@ -1008,7 +1008,7 @@
       </w:pPr>
       <w:r>
         <w:pict>
-          <v:rect style="width:0.0pt;height:1.5pt" o:hr="t" o:hrstd="t" o:hralign="center" fillcolor="#A0A0A0" stroked="f"/>
+          <v:rect style="width:0.0pt;height:1.5pt" ns3:hr="t" ns3:hrstd="t" ns3:hralign="center" fillcolor="#A0A0A0" stroked="f"/>
         </w:pict>
       </w:r>
       <w:r>
@@ -1723,7 +1723,7 @@
       </w:pPr>
       <w:r>
         <w:pict>
-          <v:rect style="width:0.0pt;height:1.5pt" o:hr="t" o:hrstd="t" o:hralign="center" fillcolor="#A0A0A0" stroked="f"/>
+          <v:rect style="width:0.0pt;height:1.5pt" ns3:hr="t" ns3:hrstd="t" ns3:hralign="center" fillcolor="#A0A0A0" stroked="f"/>
         </w:pict>
       </w:r>
       <w:r>
@@ -1761,7 +1761,7 @@
       </w:pPr>
       <w:r>
         <w:pict>
-          <v:rect style="width:0.0pt;height:1.5pt" o:hr="t" o:hrstd="t" o:hralign="center" fillcolor="#A0A0A0" stroked="f"/>
+          <v:rect style="width:0.0pt;height:1.5pt" ns3:hr="t" ns3:hrstd="t" ns3:hralign="center" fillcolor="#A0A0A0" stroked="f"/>
         </w:pict>
       </w:r>
       <w:r>
@@ -2372,7 +2372,7 @@
       </w:pPr>
       <w:r>
         <w:pict>
-          <v:rect style="width:0.0pt;height:1.5pt" o:hr="t" o:hrstd="t" o:hralign="center" fillcolor="#A0A0A0" stroked="f"/>
+          <v:rect style="width:0.0pt;height:1.5pt" ns3:hr="t" ns3:hrstd="t" ns3:hralign="center" fillcolor="#A0A0A0" stroked="f"/>
         </w:pict>
       </w:r>
       <w:r>
@@ -2413,7 +2413,7 @@
       </w:pPr>
       <w:r>
         <w:pict>
-          <v:rect style="width:0.0pt;height:1.5pt" o:hr="t" o:hrstd="t" o:hralign="center" fillcolor="#A0A0A0" stroked="f"/>
+          <v:rect style="width:0.0pt;height:1.5pt" ns3:hr="t" ns3:hrstd="t" ns3:hralign="center" fillcolor="#A0A0A0" stroked="f"/>
         </w:pict>
       </w:r>
       <w:r>
@@ -2702,7 +2702,7 @@
       </w:pPr>
       <w:r>
         <w:pict>
-          <v:rect style="width:0.0pt;height:1.5pt" o:hr="t" o:hrstd="t" o:hralign="center" fillcolor="#A0A0A0" stroked="f"/>
+          <v:rect style="width:0.0pt;height:1.5pt" ns3:hr="t" ns3:hrstd="t" ns3:hralign="center" fillcolor="#A0A0A0" stroked="f"/>
         </w:pict>
       </w:r>
       <w:r>
@@ -2743,7 +2743,7 @@
       </w:pPr>
       <w:r>
         <w:pict>
-          <v:rect style="width:0.0pt;height:1.5pt" o:hr="t" o:hrstd="t" o:hralign="center" fillcolor="#A0A0A0" stroked="f"/>
+          <v:rect style="width:0.0pt;height:1.5pt" ns3:hr="t" ns3:hrstd="t" ns3:hralign="center" fillcolor="#A0A0A0" stroked="f"/>
         </w:pict>
       </w:r>
       <w:r>
@@ -4818,7 +4818,7 @@
       </w:pPr>
       <w:r>
         <w:pict>
-          <v:rect style="width:0.0pt;height:1.5pt" o:hr="t" o:hrstd="t" o:hralign="center" fillcolor="#A0A0A0" stroked="f"/>
+          <v:rect style="width:0.0pt;height:1.5pt" ns3:hr="t" ns3:hrstd="t" ns3:hralign="center" fillcolor="#A0A0A0" stroked="f"/>
         </w:pict>
       </w:r>
       <w:r>
@@ -4859,7 +4859,7 @@
       </w:pPr>
       <w:r>
         <w:pict>
-          <v:rect style="width:0.0pt;height:1.5pt" o:hr="t" o:hrstd="t" o:hralign="center" fillcolor="#A0A0A0" stroked="f"/>
+          <v:rect style="width:0.0pt;height:1.5pt" ns3:hr="t" ns3:hrstd="t" ns3:hralign="center" fillcolor="#A0A0A0" stroked="f"/>
         </w:pict>
       </w:r>
       <w:r>
@@ -4929,7 +4929,7 @@
           <w:szCs w:val="22"/>
           <w:rtl w:val="0"/>
         </w:rPr>
-        <w:t xml:space="preserve">Ràng buộc khóa: App chỉ bị khóa khi liên kết với ít nhất một nhiệm vụ chưa hoàn thành.</w:t>
+        <w:t xml:space="preserve">Ràng buộc khóa: Một ứng dụng bị khóa khi và chỉ khi nó đang được ít nhất một nhiệm vụ yêu cầu trong chu kỳ hiện tại (requiredTaskCount(app) &gt; 0). Nhiệm vụ đã hoàn thành nhưng liên kết phần thưởng vẫn tồn tại trong chu kỳ thì ứng dụng vẫn tiếp tục bị khóa.</w:t>
       </w:r>
     </w:p>
     <w:p>
@@ -5374,7 +5374,7 @@
       </w:pPr>
       <w:r>
         <w:pict>
-          <v:rect style="width:0.0pt;height:1.5pt" o:hr="t" o:hrstd="t" o:hralign="center" fillcolor="#A0A0A0" stroked="f"/>
+          <v:rect style="width:0.0pt;height:1.5pt" ns3:hr="t" ns3:hrstd="t" ns3:hralign="center" fillcolor="#A0A0A0" stroked="f"/>
         </w:pict>
       </w:r>
       <w:r>
@@ -5415,7 +5415,7 @@
       </w:pPr>
       <w:r>
         <w:pict>
-          <v:rect style="width:0.0pt;height:1.5pt" o:hr="t" o:hrstd="t" o:hralign="center" fillcolor="#A0A0A0" stroked="f"/>
+          <v:rect style="width:0.0pt;height:1.5pt" ns3:hr="t" ns3:hrstd="t" ns3:hralign="center" fillcolor="#A0A0A0" stroked="f"/>
         </w:pict>
       </w:r>
       <w:r>
@@ -5776,7 +5776,7 @@
       </w:pPr>
       <w:r>
         <w:pict>
-          <v:rect style="width:0.0pt;height:1.5pt" o:hr="t" o:hrstd="t" o:hralign="center" fillcolor="#A0A0A0" stroked="f"/>
+          <v:rect style="width:0.0pt;height:1.5pt" ns3:hr="t" ns3:hrstd="t" ns3:hralign="center" fillcolor="#A0A0A0" stroked="f"/>
         </w:pict>
       </w:r>
       <w:r>
@@ -5790,7 +5790,34 @@
           <w:szCs w:val="36"/>
           <w:rtl w:val="0"/>
         </w:rPr>
-        <w:t xml:space="preserve">PHẦN VII — QUY TẮC MỞ KHÓA 2/3 (2/3 UNLOCK RULE)</w:t>
+        <w:t xml:space="preserve">PHẦN VII — QUY TẮC GIẢI PHÓNG ỨNG DỤNG KHỎI BẢO KHỐ 2/3 (2/3 DELETION ELIGIBILITY RULE)</w:t>
+      </w:r>
+    </w:p>
+    <w:p>
+      <w:pPr>
+        <w:spacing w:before="180" w:after="100"/>
+      </w:pPr>
+      <w:r>
+        <w:rPr>
+          <w:b/>
+          <w:color w:val="C00000"/>
+          <w:sz w:val="24"/>
+        </w:rPr>
+        <w:t>LOCK POLICY — AUTHORITATIVE CLARIFICATION (QUY TẮC PHONG ẤN CHÍNH THỨC):</w:t>
+      </w:r>
+    </w:p>
+    <w:p>
+      <w:pPr>
+        <w:spacing w:before="100" w:after="180"/>
+      </w:pPr>
+      <w:r>
+        <w:rPr>
+          <w:b/>
+        </w:rPr>
+        <w:t>Một ứng dụng bị khóa khi và chỉ khi nó đang được ít nhất một nhiệm vụ yêu cầu trong chu kỳ hiện tại (requiredTaskCount(app) &gt; 0 =&gt; LOCKED; requiredTaskCount(app) == 0 =&gt; UNLOCKED). </w:t>
+      </w:r>
+      <w:r>
+        <w:t>Điều kiện 2/3 (RequiredForDeletion(N)) CHỈ LÀ ĐIỀU KIỆN ĐỦ ĐỂ XÓA ỨNG DỤNG KHỎI BẢO KHỐ (VAULT DELETION ELIGIBILITY), TUYỆT ĐỐI KHÔNG PHẢI LÀ ĐIỀU KIỆN MỞ KHÓA ỨNG DỤNG (NOT AN UNLOCK CONDITION). Một nhiệm vụ đã hoàn thành (COMPLETED) vẫn là nhiệm vụ đang yêu cầu ứng dụng nếu liên kết phần thưởng của nó vẫn còn hiệu lực trong chu kỳ hiện tại. Ứng dụng chỉ mở khóa khi không còn bất kỳ nhiệm vụ nào trong chu kỳ hiện tại yêu cầu nó, hoặc khi có vé (Voucher) hiệu lực đè bẹp điều kiện khóa.</w:t>
       </w:r>
     </w:p>
     <w:p>
@@ -5817,7 +5844,7 @@
       </w:pPr>
       <w:r>
         <w:pict>
-          <v:rect style="width:0.0pt;height:1.5pt" o:hr="t" o:hrstd="t" o:hralign="center" fillcolor="#A0A0A0" stroked="f"/>
+          <v:rect style="width:0.0pt;height:1.5pt" ns3:hr="t" ns3:hrstd="t" ns3:hralign="center" fillcolor="#A0A0A0" stroked="f"/>
         </w:pict>
       </w:r>
       <w:r>
@@ -5861,7 +5888,7 @@
           <w:szCs w:val="22"/>
           <w:rtl w:val="0"/>
         </w:rPr>
-        <w:t xml:space="preserve">Số nhiệm vụ bắt buộc hoàn thành $ ext{Required}(N)$ trên tổng số $N$ nhiệm vụ liên kết ($N \ge 1$):</w:t>
+        <w:t xml:space="preserve">Số nhiệm vụ bắt buộc hoàn thành để đủ điều kiện xóa app $ ext{RequiredForDeletion}(N)$ trên tổng số $N$ nhiệm vụ liên kết ($N \ge 1$):</w:t>
       </w:r>
     </w:p>
     <w:p>
@@ -6109,7 +6136,7 @@
                 <w:shd w:fill="auto" w:val="clear"/>
                 <w:rtl w:val="0"/>
               </w:rPr>
-              <w:t xml:space="preserve">Số Bắt Buộc Hoàn Thành ($ ext{Required}$)</w:t>
+              <w:t xml:space="preserve">Số Bắt Buộc Hoàn Thành Để Xóa App ($ ext{RequiredForDeletion}$)</w:t>
             </w:r>
           </w:p>
         </w:tc>
@@ -6214,7 +6241,7 @@
                 <w:shd w:fill="auto" w:val="clear"/>
                 <w:rtl w:val="0"/>
               </w:rPr>
-              <w:t xml:space="preserve">Quy Tắc Đánh Giá</w:t>
+              <w:t xml:space="preserve">Quy Tắc Đánh Giá Xóa App (Delete Eligibility)</w:t>
             </w:r>
           </w:p>
         </w:tc>
@@ -6415,7 +6442,7 @@
                 <w:szCs w:val="20"/>
                 <w:rtl w:val="0"/>
               </w:rPr>
-              <w:t xml:space="preserve">Hoàn thành 1 -&gt; Mở khóa</w:t>
+              <w:t xml:space="preserve">Hoàn thành 1 -&gt; Đủ điều kiện xóa app (Vẫn LOCK nếu còn task yêu cầu)</w:t>
             </w:r>
           </w:p>
         </w:tc>
@@ -6616,7 +6643,7 @@
                 <w:szCs w:val="20"/>
                 <w:rtl w:val="0"/>
               </w:rPr>
-              <w:t xml:space="preserve">Hoàn thành 1 -&gt; Mở khóa (Đặc xá N=2)</w:t>
+              <w:t xml:space="preserve">Hoàn thành 1 -&gt; Đủ điều kiện xóa app (Đặc xá N=2, Vẫn LOCK nếu còn task yêu cầu)</w:t>
             </w:r>
           </w:p>
         </w:tc>
@@ -6817,7 +6844,7 @@
                 <w:szCs w:val="20"/>
                 <w:rtl w:val="0"/>
               </w:rPr>
-              <w:t xml:space="preserve">Hoàn thành 2 -&gt; Mở khóa</w:t>
+              <w:t xml:space="preserve">Hoàn thành 2 -&gt; Đủ điều kiện xóa app (Vẫn LOCK nếu còn task yêu cầu)</w:t>
             </w:r>
           </w:p>
         </w:tc>
@@ -7018,7 +7045,7 @@
                 <w:szCs w:val="20"/>
                 <w:rtl w:val="0"/>
               </w:rPr>
-              <w:t xml:space="preserve">Hoàn thành 3 -&gt; Mở khóa</w:t>
+              <w:t xml:space="preserve">Hoàn thành 3 -&gt; Đủ điều kiện xóa app (Vẫn LOCK nếu còn task yêu cầu)</w:t>
             </w:r>
           </w:p>
         </w:tc>
@@ -7219,7 +7246,7 @@
                 <w:szCs w:val="20"/>
                 <w:rtl w:val="0"/>
               </w:rPr>
-              <w:t xml:space="preserve">Hoàn thành 4 -&gt; Mở khóa</w:t>
+              <w:t xml:space="preserve">Hoàn thành 4 -&gt; Đủ điều kiện xóa app (Vẫn LOCK nếu còn task yêu cầu)</w:t>
             </w:r>
           </w:p>
         </w:tc>
@@ -7420,7 +7447,7 @@
                 <w:szCs w:val="20"/>
                 <w:rtl w:val="0"/>
               </w:rPr>
-              <w:t xml:space="preserve">Hoàn thành 4 -&gt; Mở khóa</w:t>
+              <w:t xml:space="preserve">Hoàn thành 4 -&gt; Đủ điều kiện xóa app (Vẫn LOCK nếu còn task yêu cầu)</w:t>
             </w:r>
           </w:p>
         </w:tc>
@@ -7621,7 +7648,7 @@
                 <w:szCs w:val="20"/>
                 <w:rtl w:val="0"/>
               </w:rPr>
-              <w:t xml:space="preserve">Hoàn thành 5 -&gt; Mở khóa</w:t>
+              <w:t xml:space="preserve">Hoàn thành 5 -&gt; Đủ điều kiện xóa app (Vẫn LOCK nếu còn task yêu cầu)</w:t>
             </w:r>
           </w:p>
         </w:tc>
@@ -7822,7 +7849,7 @@
                 <w:szCs w:val="20"/>
                 <w:rtl w:val="0"/>
               </w:rPr>
-              <w:t xml:space="preserve">Hoàn thành 6 -&gt; Mở khóa</w:t>
+              <w:t xml:space="preserve">Hoàn thành 6 -&gt; Đủ điều kiện xóa app (Vẫn LOCK nếu còn task yêu cầu)</w:t>
             </w:r>
           </w:p>
         </w:tc>
@@ -8023,7 +8050,7 @@
                 <w:szCs w:val="20"/>
                 <w:rtl w:val="0"/>
               </w:rPr>
-              <w:t xml:space="preserve">Hoàn thành 6 -&gt; Mở khóa</w:t>
+              <w:t xml:space="preserve">Hoàn thành 6 -&gt; Đủ điều kiện xóa app (Vẫn LOCK nếu còn task yêu cầu)</w:t>
             </w:r>
           </w:p>
         </w:tc>
@@ -8224,7 +8251,7 @@
                 <w:szCs w:val="20"/>
                 <w:rtl w:val="0"/>
               </w:rPr>
-              <w:t xml:space="preserve">Hoàn thành 7 -&gt; Mở khóa</w:t>
+              <w:t xml:space="preserve">Hoàn thành 7 -&gt; Đủ điều kiện xóa app (Vẫn LOCK nếu còn task yêu cầu)</w:t>
             </w:r>
           </w:p>
         </w:tc>
@@ -8253,7 +8280,7 @@
       </w:pPr>
       <w:r>
         <w:pict>
-          <v:rect style="width:0.0pt;height:1.5pt" o:hr="t" o:hrstd="t" o:hralign="center" fillcolor="#A0A0A0" stroked="f"/>
+          <v:rect style="width:0.0pt;height:1.5pt" ns3:hr="t" ns3:hrstd="t" ns3:hralign="center" fillcolor="#A0A0A0" stroked="f"/>
         </w:pict>
       </w:r>
       <w:r>
@@ -8289,7 +8316,7 @@
       </w:pPr>
       <w:r>
         <w:pict>
-          <v:rect style="width:0.0pt;height:1.5pt" o:hr="t" o:hrstd="t" o:hralign="center" fillcolor="#A0A0A0" stroked="f"/>
+          <v:rect style="width:0.0pt;height:1.5pt" ns3:hr="t" ns3:hrstd="t" ns3:hralign="center" fillcolor="#A0A0A0" stroked="f"/>
         </w:pict>
       </w:r>
       <w:r>
@@ -8411,7 +8438,7 @@
       </w:pPr>
       <w:r>
         <w:pict>
-          <v:rect style="width:0.0pt;height:1.5pt" o:hr="t" o:hrstd="t" o:hralign="center" fillcolor="#A0A0A0" stroked="f"/>
+          <v:rect style="width:0.0pt;height:1.5pt" ns3:hr="t" ns3:hrstd="t" ns3:hralign="center" fillcolor="#A0A0A0" stroked="f"/>
         </w:pict>
       </w:r>
       <w:r>
@@ -8452,7 +8479,7 @@
       </w:pPr>
       <w:r>
         <w:pict>
-          <v:rect style="width:0.0pt;height:1.5pt" o:hr="t" o:hrstd="t" o:hralign="center" fillcolor="#A0A0A0" stroked="f"/>
+          <v:rect style="width:0.0pt;height:1.5pt" ns3:hr="t" ns3:hrstd="t" ns3:hralign="center" fillcolor="#A0A0A0" stroked="f"/>
         </w:pict>
       </w:r>
       <w:r>
@@ -10568,7 +10595,7 @@
       </w:pPr>
       <w:r>
         <w:pict>
-          <v:rect style="width:0.0pt;height:1.5pt" o:hr="t" o:hrstd="t" o:hralign="center" fillcolor="#A0A0A0" stroked="f"/>
+          <v:rect style="width:0.0pt;height:1.5pt" ns3:hr="t" ns3:hrstd="t" ns3:hralign="center" fillcolor="#A0A0A0" stroked="f"/>
         </w:pict>
       </w:r>
       <w:r>
@@ -10604,7 +10631,7 @@
       </w:pPr>
       <w:r>
         <w:pict>
-          <v:rect style="width:0.0pt;height:1.5pt" o:hr="t" o:hrstd="t" o:hralign="center" fillcolor="#A0A0A0" stroked="f"/>
+          <v:rect style="width:0.0pt;height:1.5pt" ns3:hr="t" ns3:hrstd="t" ns3:hralign="center" fillcolor="#A0A0A0" stroked="f"/>
         </w:pict>
       </w:r>
       <w:r>
@@ -10753,7 +10780,7 @@
       </w:pPr>
       <w:r>
         <w:pict>
-          <v:rect style="width:0.0pt;height:1.5pt" o:hr="t" o:hrstd="t" o:hralign="center" fillcolor="#A0A0A0" stroked="f"/>
+          <v:rect style="width:0.0pt;height:1.5pt" ns3:hr="t" ns3:hrstd="t" ns3:hralign="center" fillcolor="#A0A0A0" stroked="f"/>
         </w:pict>
       </w:r>
       <w:r>
@@ -10789,7 +10816,7 @@
       </w:pPr>
       <w:r>
         <w:pict>
-          <v:rect style="width:0.0pt;height:1.5pt" o:hr="t" o:hrstd="t" o:hralign="center" fillcolor="#A0A0A0" stroked="f"/>
+          <v:rect style="width:0.0pt;height:1.5pt" ns3:hr="t" ns3:hrstd="t" ns3:hralign="center" fillcolor="#A0A0A0" stroked="f"/>
         </w:pict>
       </w:r>
       <w:r>
@@ -10910,7 +10937,7 @@
       </w:pPr>
       <w:r>
         <w:pict>
-          <v:rect style="width:0.0pt;height:1.5pt" o:hr="t" o:hrstd="t" o:hralign="center" fillcolor="#A0A0A0" stroked="f"/>
+          <v:rect style="width:0.0pt;height:1.5pt" ns3:hr="t" ns3:hrstd="t" ns3:hralign="center" fillcolor="#A0A0A0" stroked="f"/>
         </w:pict>
       </w:r>
       <w:r>
@@ -10946,7 +10973,7 @@
       </w:pPr>
       <w:r>
         <w:pict>
-          <v:rect style="width:0.0pt;height:1.5pt" o:hr="t" o:hrstd="t" o:hralign="center" fillcolor="#A0A0A0" stroked="f"/>
+          <v:rect style="width:0.0pt;height:1.5pt" ns3:hr="t" ns3:hrstd="t" ns3:hralign="center" fillcolor="#A0A0A0" stroked="f"/>
         </w:pict>
       </w:r>
       <w:r>
@@ -11096,7 +11123,7 @@
       </w:pPr>
       <w:r>
         <w:pict>
-          <v:rect style="width:0.0pt;height:1.5pt" o:hr="t" o:hrstd="t" o:hralign="center" fillcolor="#A0A0A0" stroked="f"/>
+          <v:rect style="width:0.0pt;height:1.5pt" ns3:hr="t" ns3:hrstd="t" ns3:hralign="center" fillcolor="#A0A0A0" stroked="f"/>
         </w:pict>
       </w:r>
       <w:r>
@@ -11137,7 +11164,7 @@
       </w:pPr>
       <w:r>
         <w:pict>
-          <v:rect style="width:0.0pt;height:1.5pt" o:hr="t" o:hrstd="t" o:hralign="center" fillcolor="#A0A0A0" stroked="f"/>
+          <v:rect style="width:0.0pt;height:1.5pt" ns3:hr="t" ns3:hrstd="t" ns3:hralign="center" fillcolor="#A0A0A0" stroked="f"/>
         </w:pict>
       </w:r>
       <w:r>
@@ -14690,7 +14717,7 @@
       </w:pPr>
       <w:r>
         <w:pict>
-          <v:rect style="width:0.0pt;height:1.5pt" o:hr="t" o:hrstd="t" o:hralign="center" fillcolor="#A0A0A0" stroked="f"/>
+          <v:rect style="width:0.0pt;height:1.5pt" ns3:hr="t" ns3:hrstd="t" ns3:hralign="center" fillcolor="#A0A0A0" stroked="f"/>
         </w:pict>
       </w:r>
       <w:r>
@@ -14726,7 +14753,7 @@
       </w:pPr>
       <w:r>
         <w:pict>
-          <v:rect style="width:0.0pt;height:1.5pt" o:hr="t" o:hrstd="t" o:hralign="center" fillcolor="#A0A0A0" stroked="f"/>
+          <v:rect style="width:0.0pt;height:1.5pt" ns3:hr="t" ns3:hrstd="t" ns3:hralign="center" fillcolor="#A0A0A0" stroked="f"/>
         </w:pict>
       </w:r>
       <w:r>
@@ -14819,7 +14846,7 @@
       </w:pPr>
       <w:r>
         <w:pict>
-          <v:rect style="width:0.0pt;height:1.5pt" o:hr="t" o:hrstd="t" o:hralign="center" fillcolor="#A0A0A0" stroked="f"/>
+          <v:rect style="width:0.0pt;height:1.5pt" ns3:hr="t" ns3:hrstd="t" ns3:hralign="center" fillcolor="#A0A0A0" stroked="f"/>
         </w:pict>
       </w:r>
       <w:r>
@@ -14855,7 +14882,7 @@
       </w:pPr>
       <w:r>
         <w:pict>
-          <v:rect style="width:0.0pt;height:1.5pt" o:hr="t" o:hrstd="t" o:hralign="center" fillcolor="#A0A0A0" stroked="f"/>
+          <v:rect style="width:0.0pt;height:1.5pt" ns3:hr="t" ns3:hrstd="t" ns3:hralign="center" fillcolor="#A0A0A0" stroked="f"/>
         </w:pict>
       </w:r>
       <w:r>
@@ -14976,7 +15003,7 @@
       </w:pPr>
       <w:r>
         <w:pict>
-          <v:rect style="width:0.0pt;height:1.5pt" o:hr="t" o:hrstd="t" o:hralign="center" fillcolor="#A0A0A0" stroked="f"/>
+          <v:rect style="width:0.0pt;height:1.5pt" ns3:hr="t" ns3:hrstd="t" ns3:hralign="center" fillcolor="#A0A0A0" stroked="f"/>
         </w:pict>
       </w:r>
       <w:r>
@@ -15012,7 +15039,7 @@
       </w:pPr>
       <w:r>
         <w:pict>
-          <v:rect style="width:0.0pt;height:1.5pt" o:hr="t" o:hrstd="t" o:hralign="center" fillcolor="#A0A0A0" stroked="f"/>
+          <v:rect style="width:0.0pt;height:1.5pt" ns3:hr="t" ns3:hrstd="t" ns3:hralign="center" fillcolor="#A0A0A0" stroked="f"/>
         </w:pict>
       </w:r>
       <w:r>
@@ -15099,7 +15126,7 @@
       </w:pPr>
       <w:r>
         <w:pict>
-          <v:rect style="width:0.0pt;height:1.5pt" o:hr="t" o:hrstd="t" o:hralign="center" fillcolor="#A0A0A0" stroked="f"/>
+          <v:rect style="width:0.0pt;height:1.5pt" ns3:hr="t" ns3:hrstd="t" ns3:hralign="center" fillcolor="#A0A0A0" stroked="f"/>
         </w:pict>
       </w:r>
       <w:r>
@@ -15135,7 +15162,7 @@
       </w:pPr>
       <w:r>
         <w:pict>
-          <v:rect style="width:0.0pt;height:1.5pt" o:hr="t" o:hrstd="t" o:hralign="center" fillcolor="#A0A0A0" stroked="f"/>
+          <v:rect style="width:0.0pt;height:1.5pt" ns3:hr="t" ns3:hrstd="t" ns3:hralign="center" fillcolor="#A0A0A0" stroked="f"/>
         </w:pict>
       </w:r>
       <w:r>
@@ -15256,7 +15283,7 @@
       </w:pPr>
       <w:r>
         <w:pict>
-          <v:rect style="width:0.0pt;height:1.5pt" o:hr="t" o:hrstd="t" o:hralign="center" fillcolor="#A0A0A0" stroked="f"/>
+          <v:rect style="width:0.0pt;height:1.5pt" ns3:hr="t" ns3:hrstd="t" ns3:hralign="center" fillcolor="#A0A0A0" stroked="f"/>
         </w:pict>
       </w:r>
       <w:r>
@@ -15292,7 +15319,7 @@
       </w:pPr>
       <w:r>
         <w:pict>
-          <v:rect style="width:0.0pt;height:1.5pt" o:hr="t" o:hrstd="t" o:hralign="center" fillcolor="#A0A0A0" stroked="f"/>
+          <v:rect style="width:0.0pt;height:1.5pt" ns3:hr="t" ns3:hrstd="t" ns3:hralign="center" fillcolor="#A0A0A0" stroked="f"/>
         </w:pict>
       </w:r>
       <w:r>
@@ -15385,7 +15412,7 @@
       </w:pPr>
       <w:r>
         <w:pict>
-          <v:rect style="width:0.0pt;height:1.5pt" o:hr="t" o:hrstd="t" o:hralign="center" fillcolor="#A0A0A0" stroked="f"/>
+          <v:rect style="width:0.0pt;height:1.5pt" ns3:hr="t" ns3:hrstd="t" ns3:hralign="center" fillcolor="#A0A0A0" stroked="f"/>
         </w:pict>
       </w:r>
       <w:r>
@@ -15421,7 +15448,7 @@
       </w:pPr>
       <w:r>
         <w:pict>
-          <v:rect style="width:0.0pt;height:1.5pt" o:hr="t" o:hrstd="t" o:hralign="center" fillcolor="#A0A0A0" stroked="f"/>
+          <v:rect style="width:0.0pt;height:1.5pt" ns3:hr="t" ns3:hrstd="t" ns3:hralign="center" fillcolor="#A0A0A0" stroked="f"/>
         </w:pict>
       </w:r>
       <w:r>
@@ -15620,7 +15647,7 @@
       </w:pPr>
       <w:r>
         <w:pict>
-          <v:rect style="width:0.0pt;height:1.5pt" o:hr="t" o:hrstd="t" o:hralign="center" fillcolor="#A0A0A0" stroked="f"/>
+          <v:rect style="width:0.0pt;height:1.5pt" ns3:hr="t" ns3:hrstd="t" ns3:hralign="center" fillcolor="#A0A0A0" stroked="f"/>
         </w:pict>
       </w:r>
       <w:r>
@@ -15656,7 +15683,7 @@
       </w:pPr>
       <w:r>
         <w:pict>
-          <v:rect style="width:0.0pt;height:1.5pt" o:hr="t" o:hrstd="t" o:hralign="center" fillcolor="#A0A0A0" stroked="f"/>
+          <v:rect style="width:0.0pt;height:1.5pt" ns3:hr="t" ns3:hrstd="t" ns3:hralign="center" fillcolor="#A0A0A0" stroked="f"/>
         </w:pict>
       </w:r>
       <w:r>
@@ -15743,7 +15770,7 @@
       </w:pPr>
       <w:r>
         <w:pict>
-          <v:rect style="width:0.0pt;height:1.5pt" o:hr="t" o:hrstd="t" o:hralign="center" fillcolor="#A0A0A0" stroked="f"/>
+          <v:rect style="width:0.0pt;height:1.5pt" ns3:hr="t" ns3:hrstd="t" ns3:hralign="center" fillcolor="#A0A0A0" stroked="f"/>
         </w:pict>
       </w:r>
       <w:r>
@@ -15779,7 +15806,7 @@
       </w:pPr>
       <w:r>
         <w:pict>
-          <v:rect style="width:0.0pt;height:1.5pt" o:hr="t" o:hrstd="t" o:hralign="center" fillcolor="#A0A0A0" stroked="f"/>
+          <v:rect style="width:0.0pt;height:1.5pt" ns3:hr="t" ns3:hrstd="t" ns3:hralign="center" fillcolor="#A0A0A0" stroked="f"/>
         </w:pict>
       </w:r>
       <w:r>
@@ -15844,7 +15871,7 @@
       </w:pPr>
       <w:r>
         <w:pict>
-          <v:rect style="width:0.0pt;height:1.5pt" o:hr="t" o:hrstd="t" o:hralign="center" fillcolor="#A0A0A0" stroked="f"/>
+          <v:rect style="width:0.0pt;height:1.5pt" ns3:hr="t" ns3:hrstd="t" ns3:hralign="center" fillcolor="#A0A0A0" stroked="f"/>
         </w:pict>
       </w:r>
       <w:r>
@@ -15880,7 +15907,7 @@
       </w:pPr>
       <w:r>
         <w:pict>
-          <v:rect style="width:0.0pt;height:1.5pt" o:hr="t" o:hrstd="t" o:hralign="center" fillcolor="#A0A0A0" stroked="f"/>
+          <v:rect style="width:0.0pt;height:1.5pt" ns3:hr="t" ns3:hrstd="t" ns3:hralign="center" fillcolor="#A0A0A0" stroked="f"/>
         </w:pict>
       </w:r>
       <w:r>
@@ -15946,7 +15973,7 @@
       </w:pPr>
       <w:r>
         <w:pict>
-          <v:rect style="width:0.0pt;height:1.5pt" o:hr="t" o:hrstd="t" o:hralign="center" fillcolor="#A0A0A0" stroked="f"/>
+          <v:rect style="width:0.0pt;height:1.5pt" ns3:hr="t" ns3:hrstd="t" ns3:hralign="center" fillcolor="#A0A0A0" stroked="f"/>
         </w:pict>
       </w:r>
       <w:r>
@@ -15987,7 +16014,7 @@
       </w:pPr>
       <w:r>
         <w:pict>
-          <v:rect style="width:0.0pt;height:1.5pt" o:hr="t" o:hrstd="t" o:hralign="center" fillcolor="#A0A0A0" stroked="f"/>
+          <v:rect style="width:0.0pt;height:1.5pt" ns3:hr="t" ns3:hrstd="t" ns3:hralign="center" fillcolor="#A0A0A0" stroked="f"/>
         </w:pict>
       </w:r>
       <w:r>
@@ -16270,7 +16297,7 @@
       </w:pPr>
       <w:r>
         <w:pict>
-          <v:rect style="width:0.0pt;height:1.5pt" o:hr="t" o:hrstd="t" o:hralign="center" fillcolor="#A0A0A0" stroked="f"/>
+          <v:rect style="width:0.0pt;height:1.5pt" ns3:hr="t" ns3:hrstd="t" ns3:hralign="center" fillcolor="#A0A0A0" stroked="f"/>
         </w:pict>
       </w:r>
       <w:r>
@@ -16306,7 +16333,7 @@
       </w:pPr>
       <w:r>
         <w:pict>
-          <v:rect style="width:0.0pt;height:1.5pt" o:hr="t" o:hrstd="t" o:hralign="center" fillcolor="#A0A0A0" stroked="f"/>
+          <v:rect style="width:0.0pt;height:1.5pt" ns3:hr="t" ns3:hrstd="t" ns3:hralign="center" fillcolor="#A0A0A0" stroked="f"/>
         </w:pict>
       </w:r>
       <w:r>
@@ -16317,7 +16344,7 @@
           <w:szCs w:val="22"/>
           <w:rtl w:val="0"/>
         </w:rPr>
-        <w:t xml:space="preserve">INV-APP-001: App bị khóa khi và chỉ khi có ít nhất 1 nhiệm vụ chưa hoàn thành trong chu kỳ và không có vé hiệu lực.</w:t>
+        <w:t xml:space="preserve">INV-APP-001: Một ứng dụng bị khóa khi và chỉ khi nó đang được ít nhất một nhiệm vụ yêu cầu trong chu kỳ hiện tại (requiredTaskCount(app) &gt; 0) và không có vé hiệu lực.</w:t>
       </w:r>
     </w:p>
     <w:p>
@@ -16624,7 +16651,7 @@
       </w:pPr>
       <w:r>
         <w:pict>
-          <v:rect style="width:0.0pt;height:1.5pt" o:hr="t" o:hrstd="t" o:hralign="center" fillcolor="#A0A0A0" stroked="f"/>
+          <v:rect style="width:0.0pt;height:1.5pt" ns3:hr="t" ns3:hrstd="t" ns3:hralign="center" fillcolor="#A0A0A0" stroked="f"/>
         </w:pict>
       </w:r>
       <w:r>
@@ -16665,7 +16692,7 @@
       </w:pPr>
       <w:r>
         <w:pict>
-          <v:rect style="width:0.0pt;height:1.5pt" o:hr="t" o:hrstd="t" o:hralign="center" fillcolor="#A0A0A0" stroked="f"/>
+          <v:rect style="width:0.0pt;height:1.5pt" ns3:hr="t" ns3:hrstd="t" ns3:hralign="center" fillcolor="#A0A0A0" stroked="f"/>
         </w:pict>
       </w:r>
       <w:r>
@@ -18391,7 +18418,7 @@
       </w:pPr>
       <w:r>
         <w:pict>
-          <v:rect style="width:0.0pt;height:1.5pt" o:hr="t" o:hrstd="t" o:hralign="center" fillcolor="#A0A0A0" stroked="f"/>
+          <v:rect style="width:0.0pt;height:1.5pt" ns3:hr="t" ns3:hrstd="t" ns3:hralign="center" fillcolor="#A0A0A0" stroked="f"/>
         </w:pict>
       </w:r>
       <w:r>
@@ -18429,7 +18456,7 @@
       </w:pPr>
       <w:r>
         <w:pict>
-          <v:rect style="width:0.0pt;height:1.5pt" o:hr="t" o:hrstd="t" o:hralign="center" fillcolor="#A0A0A0" stroked="f"/>
+          <v:rect style="width:0.0pt;height:1.5pt" ns3:hr="t" ns3:hrstd="t" ns3:hralign="center" fillcolor="#A0A0A0" stroked="f"/>
         </w:pict>
       </w:r>
       <w:r>
@@ -18580,7 +18607,7 @@
           <w:szCs w:val="22"/>
           <w:rtl w:val="0"/>
         </w:rPr>
-        <w:t xml:space="preserve">VAULT-002: App chỉ bị khóa khi có ít nhất 1 nhiệm vụ chưa hoàn thành.</w:t>
+        <w:t xml:space="preserve">VAULT-002: Một ứng dụng bị khóa khi và chỉ khi nó đang được ít nhất một nhiệm vụ yêu cầu trong chu kỳ hiện tại (requiredTaskCount(app) &gt; 0).</w:t>
       </w:r>
     </w:p>
     <w:p>
@@ -19027,7 +19054,7 @@
       </w:pPr>
       <w:r>
         <w:pict>
-          <v:rect style="width:0.0pt;height:1.5pt" o:hr="t" o:hrstd="t" o:hralign="center" fillcolor="#A0A0A0" stroked="f"/>
+          <v:rect style="width:0.0pt;height:1.5pt" ns3:hr="t" ns3:hrstd="t" ns3:hralign="center" fillcolor="#A0A0A0" stroked="f"/>
         </w:pict>
       </w:r>
       <w:r>
@@ -19068,7 +19095,7 @@
       </w:pPr>
       <w:r>
         <w:pict>
-          <v:rect style="width:0.0pt;height:1.5pt" o:hr="t" o:hrstd="t" o:hralign="center" fillcolor="#A0A0A0" stroked="f"/>
+          <v:rect style="width:0.0pt;height:1.5pt" ns3:hr="t" ns3:hrstd="t" ns3:hralign="center" fillcolor="#A0A0A0" stroked="f"/>
         </w:pict>
       </w:r>
       <w:r>
@@ -19082,7 +19109,7 @@
           <w:szCs w:val="28"/>
           <w:rtl w:val="0"/>
         </w:rPr>
-        <w:t xml:space="preserve">Kịch Bản 1: Đánh Giá Quy Tắc Mở Khóa 2/3</w:t>
+        <w:t xml:space="preserve">Kịch Bản 1: Đánh Giá Điều Kiện Giải Phóng App 2/3 (Delete Eligibility)</w:t>
       </w:r>
     </w:p>
     <w:p>
@@ -19194,7 +19221,7 @@
           <w:szCs w:val="22"/>
           <w:rtl w:val="0"/>
         </w:rPr>
-        <w:t xml:space="preserve">Tại Nhiệm vụ 2 ($K=2$): $ ext{Required} = \lceil 2 imes 4 / 3 ceil = 3$. Vì $2 &lt; 3$, TikTok vẫn bị khóa.</w:t>
+        <w:t xml:space="preserve">Tại Nhiệm vụ 2 ($K=2$): $ ext{RequiredForDeletion} = \lceil 2 \times 4 / 3 \rceil = 3$. Vì $2 &lt; 3$, chưa đủ điều kiện xóa app nếu người dùng yêu cầu xóa; TikTok vẫn bị khóa vì còn nhiệm vụ yêu cầu.</w:t>
       </w:r>
     </w:p>
     <w:p>
@@ -19222,7 +19249,7 @@
           <w:szCs w:val="22"/>
           <w:rtl w:val="0"/>
         </w:rPr>
-        <w:t xml:space="preserve">Tại Nhiệm vụ 3 ($K=3$): Vì $3 \ge 3$, TikTok lập tức mở khóa (`MANAGED_UNLOCKED`), cho phép truy cập thẳng mà không bị chặn.</w:t>
+        <w:t xml:space="preserve">Tại Nhiệm vụ 3 ($K=3$): Vì $3 \ge 3$, TikTok ĐỦ ĐIỀU KIỆN XÓA KHỎI BẢO KHỐ (DELETE_ALLOWED). Nhưng nếu Ký chủ không xóa app, TikTok VẪN TIẾP TỤC BỊ KHÓA (`MANAGED_LOCKED`) vì các nhiệm vụ liên kết vẫn đang yêu cầu nó trong chu kỳ hiện tại.</w:t>
       </w:r>
     </w:p>
     <w:p>
@@ -19627,7 +19654,7 @@
       </w:pPr>
       <w:r>
         <w:pict>
-          <v:rect style="width:0.0pt;height:1.5pt" o:hr="t" o:hrstd="t" o:hralign="center" fillcolor="#A0A0A0" stroked="f"/>
+          <v:rect style="width:0.0pt;height:1.5pt" ns3:hr="t" ns3:hrstd="t" ns3:hralign="center" fillcolor="#A0A0A0" stroked="f"/>
         </w:pict>
       </w:r>
       <w:r>
@@ -19668,7 +19695,7 @@
       </w:pPr>
       <w:r>
         <w:pict>
-          <v:rect style="width:0.0pt;height:1.5pt" o:hr="t" o:hrstd="t" o:hralign="center" fillcolor="#A0A0A0" stroked="f"/>
+          <v:rect style="width:0.0pt;height:1.5pt" ns3:hr="t" ns3:hrstd="t" ns3:hralign="center" fillcolor="#A0A0A0" stroked="f"/>
         </w:pict>
       </w:r>
       <w:r>
@@ -20909,7 +20936,7 @@
                 <w:szCs w:val="20"/>
                 <w:rtl w:val="0"/>
               </w:rPr>
-              <w:t xml:space="preserve">Test 2/3 Unlock</w:t>
+              <w:t xml:space="preserve">Test 2/3 Deletion Eligibility</w:t>
             </w:r>
           </w:p>
         </w:tc>
@@ -22703,7 +22730,7 @@
       </w:pPr>
       <w:r>
         <w:pict>
-          <v:rect style="width:0.0pt;height:1.5pt" o:hr="t" o:hrstd="t" o:hralign="center" fillcolor="#A0A0A0" stroked="f"/>
+          <v:rect style="width:0.0pt;height:1.5pt" ns3:hr="t" ns3:hrstd="t" ns3:hralign="center" fillcolor="#A0A0A0" stroked="f"/>
         </w:pict>
       </w:r>
       <w:r>
@@ -22744,7 +22771,7 @@
       </w:pPr>
       <w:r>
         <w:pict>
-          <v:rect style="width:0.0pt;height:1.5pt" o:hr="t" o:hrstd="t" o:hralign="center" fillcolor="#A0A0A0" stroked="f"/>
+          <v:rect style="width:0.0pt;height:1.5pt" ns3:hr="t" ns3:hrstd="t" ns3:hralign="center" fillcolor="#A0A0A0" stroked="f"/>
         </w:pict>
       </w:r>
       <w:r>
@@ -26094,7 +26121,7 @@
       </w:pPr>
       <w:r>
         <w:pict>
-          <v:rect style="width:0.0pt;height:1.5pt" o:hr="t" o:hrstd="t" o:hralign="center" fillcolor="#A0A0A0" stroked="f"/>
+          <v:rect style="width:0.0pt;height:1.5pt" ns3:hr="t" ns3:hrstd="t" ns3:hralign="center" fillcolor="#A0A0A0" stroked="f"/>
         </w:pict>
       </w:r>
       <w:r>
@@ -26130,7 +26157,7 @@
       </w:pPr>
       <w:r>
         <w:pict>
-          <v:rect style="width:0.0pt;height:1.5pt" o:hr="t" o:hrstd="t" o:hralign="center" fillcolor="#A0A0A0" stroked="f"/>
+          <v:rect style="width:0.0pt;height:1.5pt" ns3:hr="t" ns3:hrstd="t" ns3:hralign="center" fillcolor="#A0A0A0" stroked="f"/>
         </w:pict>
       </w:r>
       <w:r>
@@ -26612,7 +26639,7 @@
       </w:pPr>
       <w:r>
         <w:pict>
-          <v:rect style="width:0.0pt;height:1.5pt" o:hr="t" o:hrstd="t" o:hralign="center" fillcolor="#A0A0A0" stroked="f"/>
+          <v:rect style="width:0.0pt;height:1.5pt" ns3:hr="t" ns3:hrstd="t" ns3:hralign="center" fillcolor="#A0A0A0" stroked="f"/>
         </w:pict>
       </w:r>
       <w:r>

</xml_diff>